<commit_message>
docs: finalize English defense package
</commit_message>
<xml_diff>
--- a/submission/submission_details.docx
+++ b/submission/submission_details.docx
@@ -386,17 +386,8 @@
             <w:shd w:fill="F2F4F7"/>
           </w:tcPr>
           <w:p>
-            <w:pPr>
-              <w:spacing w:after="0"/>
-            </w:pPr>
             <w:r>
-              <w:rPr>
-                <w:rFonts w:ascii="Calibri" w:hAnsi="Calibri"/>
-                <w:b/>
-                <w:color w:val="1F4D78"/>
-                <w:sz w:val="22"/>
-              </w:rPr>
-              <w:t>Prepared</w:t>
+              <w:t>Updated</w:t>
             </w:r>
           </w:p>
         </w:tc>
@@ -412,17 +403,8 @@
             <w:vAlign w:val="center"/>
           </w:tcPr>
           <w:p>
-            <w:pPr>
-              <w:spacing w:after="0"/>
-            </w:pPr>
             <w:r>
-              <w:rPr>
-                <w:rFonts w:ascii="Calibri" w:hAnsi="Calibri"/>
-                <w:b w:val="0"/>
-                <w:color w:val="000000"/>
-                <w:sz w:val="22"/>
-              </w:rPr>
-              <w:t>01.08.2026</w:t>
+              <w:t>16.08.2026</w:t>
             </w:r>
           </w:p>
         </w:tc>
@@ -474,7 +456,7 @@
           <w:color w:val="000000"/>
           <w:sz w:val="22"/>
         </w:rPr>
-        <w:t>The selected controlled Random Forest achieved final test MAE 4.417919 and RMSE 9.132909 on 57,480 rows. The four-week-mean baseline test MAE was 4.787413, so the model improved MAE by 7.72%. A fresh-clone test reproduced the demo prediction and all 18 automated tests passed.</w:t>
+        <w:t>The selected controlled Random Forest achieved final test MAE 4.417919 and RMSE 9.132909 on 57,480 rows. The four-week-mean baseline test MAE was 4.787413, so the model improved MAE by 7.72%. The dated fresh-clone test reproduced the demo prediction and passed all 18 tests available at that time. The current repository suite contains 26 passing automated tests.</w:t>
       </w:r>
     </w:p>
     <w:p>

</xml_diff>